<commit_message>
docs: atualiza relatório Gabriela — timbrado, acentos e texto preto justificado
Co-Authored-By: Claude Sonnet 4.6 <noreply@anthropic.com>
Claude-Session: https://claude.ai/code/session_01NdDMccMpiwCWb3jB9T1LmE
</commit_message>
<xml_diff>
--- a/Relatorio_Gabriela_Dal_Santo.docx
+++ b/Relatorio_Gabriela_Dal_Santo.docx
@@ -4,7 +4,15 @@
   <w:body>
     <w:p>
       <w:pPr>
-        <w:spacing w:before="0" w:after="40"/>
+        <w:spacing w:before="0" w:after="80"/>
+        <w:pBdr>
+          <w:top w:val="single" w:sz="18" w:space="1" w:color="000000"/>
+        </w:pBdr>
+      </w:pPr>
+    </w:p>
+    <w:p>
+      <w:pPr>
+        <w:spacing w:before="40" w:after="40"/>
         <w:jc w:val="center"/>
       </w:pPr>
       <w:r>
@@ -12,8 +20,8 @@
           <w:rFonts w:ascii="Quattrocento Sans" w:hAnsi="Quattrocento Sans"/>
           <w:b/>
           <w:i w:val="0"/>
-          <w:color w:val="312E81"/>
-          <w:sz w:val="32"/>
+          <w:color w:val="000000"/>
+          <w:sz w:val="34"/>
         </w:rPr>
         <w:t>FLAVIANE BILHAR CALER</w:t>
       </w:r>
@@ -27,11 +35,27 @@
         <w:rPr>
           <w:rFonts w:ascii="Quattrocento Sans" w:hAnsi="Quattrocento Sans"/>
           <w:b w:val="0"/>
+          <w:i w:val="0"/>
+          <w:color w:val="000000"/>
+          <w:sz w:val="20"/>
+        </w:rPr>
+        <w:t>A D V O G A D A</w:t>
+      </w:r>
+    </w:p>
+    <w:p>
+      <w:pPr>
+        <w:spacing w:before="0" w:after="40"/>
+        <w:jc w:val="center"/>
+      </w:pPr>
+      <w:r>
+        <w:rPr>
+          <w:rFonts w:ascii="Quattrocento Sans" w:hAnsi="Quattrocento Sans"/>
+          <w:b w:val="0"/>
           <w:i/>
-          <w:color w:val="646478"/>
-          <w:sz w:val="22"/>
+          <w:color w:val="000000"/>
+          <w:sz w:val="20"/>
         </w:rPr>
-        <w:t>Advogada  |  OAB/SC 54.395</w:t>
+        <w:t>OAB/SC 54.395  —  Direito da Saúde  &amp;  Direito Previdenciário</w:t>
       </w:r>
     </w:p>
     <w:p>
@@ -44,10 +68,50 @@
           <w:rFonts w:ascii="Quattrocento Sans" w:hAnsi="Quattrocento Sans"/>
           <w:b w:val="0"/>
           <w:i w:val="0"/>
-          <w:color w:val="78648C"/>
-          <w:sz w:val="20"/>
+          <w:color w:val="000000"/>
+          <w:sz w:val="18"/>
         </w:rPr>
-        <w:t>Direito da Saude  &amp;  Direito Previdenciario</w:t>
+        <w:t>Fernando Machado, 141-E, Sala 1001 — Edifício IL Centenário — Chapecó/SC</w:t>
+      </w:r>
+    </w:p>
+    <w:p>
+      <w:pPr>
+        <w:spacing w:before="0" w:after="80"/>
+        <w:jc w:val="center"/>
+      </w:pPr>
+      <w:r>
+        <w:rPr>
+          <w:rFonts w:ascii="Quattrocento Sans" w:hAnsi="Quattrocento Sans"/>
+          <w:b w:val="0"/>
+          <w:i w:val="0"/>
+          <w:color w:val="000000"/>
+          <w:sz w:val="18"/>
+        </w:rPr>
+        <w:t>(49) 98806-1881  |  admflavianecaler@gmail.com</w:t>
+      </w:r>
+    </w:p>
+    <w:p>
+      <w:pPr>
+        <w:spacing w:before="40" w:after="120"/>
+        <w:pBdr>
+          <w:bottom w:val="single" w:sz="6" w:space="1" w:color="000000"/>
+        </w:pBdr>
+      </w:pPr>
+    </w:p>
+    <w:p>
+      <w:pPr>
+        <w:spacing w:before="200" w:after="40"/>
+        <w:jc w:val="center"/>
+      </w:pPr>
+      <w:r>
+        <w:rPr>
+          <w:rFonts w:ascii="Quattrocento Sans" w:hAnsi="Quattrocento Sans"/>
+          <w:b/>
+          <w:i w:val="0"/>
+          <w:color w:val="000000"/>
+          <w:sz w:val="28"/>
+        </w:rPr>
+        <w:t>RELATÓRIO DE ANDAMENTO PROCESSUAL</w:t>
       </w:r>
     </w:p>
     <w:p>
@@ -60,55 +124,10 @@
           <w:rFonts w:ascii="Quattrocento Sans" w:hAnsi="Quattrocento Sans"/>
           <w:b w:val="0"/>
           <w:i w:val="0"/>
-          <w:color w:val="8C8C8C"/>
-          <w:sz w:val="18"/>
+          <w:color w:val="000000"/>
+          <w:sz w:val="22"/>
         </w:rPr>
-        <w:t>Fernando Machado, 141-E, Sala 1001 — Edificio IL Centenario, Chapeco/SC</w:t>
-      </w:r>
-    </w:p>
-    <w:p>
-      <w:pPr>
-        <w:spacing w:before="0" w:after="120"/>
-        <w:jc w:val="center"/>
-      </w:pPr>
-      <w:r>
-        <w:rPr>
-          <w:rFonts w:ascii="Quattrocento Sans" w:hAnsi="Quattrocento Sans"/>
-          <w:b w:val="0"/>
-          <w:i w:val="0"/>
-          <w:color w:val="8C8C8C"/>
-          <w:sz w:val="18"/>
-        </w:rPr>
-        <w:t>(49) 98806-1881  |  admflavianecaler@gmail.com</w:t>
-      </w:r>
-    </w:p>
-    <w:p>
-      <w:pPr>
-        <w:spacing w:before="40" w:after="40"/>
-      </w:pPr>
-      <w:r>
-        <w:rPr>
-          <w:rFonts w:ascii="Quattrocento Sans" w:hAnsi="Quattrocento Sans"/>
-          <w:color w:val="B4B4C8"/>
-          <w:sz w:val="18"/>
-        </w:rPr>
-        <w:t>________________________________________________________________________________</w:t>
-      </w:r>
-    </w:p>
-    <w:p>
-      <w:pPr>
-        <w:spacing w:before="280" w:after="80"/>
-        <w:jc w:val="center"/>
-      </w:pPr>
-      <w:r>
-        <w:rPr>
-          <w:rFonts w:ascii="Quattrocento Sans" w:hAnsi="Quattrocento Sans"/>
-          <w:b/>
-          <w:i w:val="0"/>
-          <w:color w:val="312E81"/>
-          <w:sz w:val="30"/>
-        </w:rPr>
-        <w:t>RELATORIO DE ANDAMENTO DO SEU CASO</w:t>
+        <w:t>Cliente: Gabriela Dal Santo</w:t>
       </w:r>
     </w:p>
     <w:p>
@@ -121,23 +140,7 @@
           <w:rFonts w:ascii="Quattrocento Sans" w:hAnsi="Quattrocento Sans"/>
           <w:b w:val="0"/>
           <w:i w:val="0"/>
-          <w:color w:val="505064"/>
-          <w:sz w:val="22"/>
-        </w:rPr>
-        <w:t>Para: Gabriela Dal Santo</w:t>
-      </w:r>
-    </w:p>
-    <w:p>
-      <w:pPr>
-        <w:spacing w:before="0" w:after="40"/>
-        <w:jc w:val="center"/>
-      </w:pPr>
-      <w:r>
-        <w:rPr>
-          <w:rFonts w:ascii="Quattrocento Sans" w:hAnsi="Quattrocento Sans"/>
-          <w:b w:val="0"/>
-          <w:i w:val="0"/>
-          <w:color w:val="505064"/>
+          <w:color w:val="000000"/>
           <w:sz w:val="22"/>
         </w:rPr>
         <w:t>Data: 21 de junho de 2026</w:t>
@@ -153,206 +156,207 @@
           <w:rFonts w:ascii="Quattrocento Sans" w:hAnsi="Quattrocento Sans"/>
           <w:b w:val="0"/>
           <w:i w:val="0"/>
-          <w:color w:val="78788C"/>
+          <w:color w:val="000000"/>
           <w:sz w:val="20"/>
         </w:rPr>
-        <w:t>Processo no 5012537-35.2026.8.24.0018</w:t>
+        <w:t>Processo nº 5012537-35.2026.8.24.0018</w:t>
       </w:r>
     </w:p>
     <w:p>
       <w:pPr>
-        <w:spacing w:before="40" w:after="40"/>
+        <w:spacing w:before="40" w:after="120"/>
+        <w:pBdr>
+          <w:bottom w:val="single" w:sz="6" w:space="1" w:color="000000"/>
+        </w:pBdr>
       </w:pPr>
-      <w:r>
-        <w:rPr>
-          <w:rFonts w:ascii="Quattrocento Sans" w:hAnsi="Quattrocento Sans"/>
-          <w:color w:val="B4B4C8"/>
-          <w:sz w:val="18"/>
-        </w:rPr>
-        <w:t>________________________________________________________________________________</w:t>
-      </w:r>
     </w:p>
     <w:p>
       <w:pPr>
-        <w:spacing w:before="240" w:after="80"/>
-        <w:jc w:val="left"/>
+        <w:spacing w:before="280" w:after="80"/>
+        <w:jc w:val="both"/>
       </w:pPr>
       <w:r>
         <w:rPr>
           <w:rFonts w:ascii="Quattrocento Sans" w:hAnsi="Quattrocento Sans"/>
           <w:b/>
           <w:i w:val="0"/>
-          <w:color w:val="312E81"/>
+          <w:color w:val="000000"/>
           <w:sz w:val="26"/>
         </w:rPr>
-        <w:t>1. O QUE E O SEU CASO</w:t>
+        <w:t>1. O QUE É O SEU CASO</w:t>
       </w:r>
     </w:p>
     <w:p>
       <w:pPr>
         <w:spacing w:before="0" w:after="120"/>
-        <w:jc w:val="left"/>
+        <w:jc w:val="both"/>
       </w:pPr>
       <w:r>
         <w:rPr>
           <w:rFonts w:ascii="Quattrocento Sans" w:hAnsi="Quattrocento Sans"/>
           <w:b w:val="0"/>
           <w:i w:val="0"/>
+          <w:color w:val="000000"/>
           <w:sz w:val="24"/>
         </w:rPr>
-        <w:t>Voce entrou com uma acao judicial contra a UNIMED Santa Catarina porque o plano de saude se recusou a cobrir o tratamento que o seu medico indicou para as dores cronicas que voce enfrenta ha 8 anos.</w:t>
+        <w:t>Você entrou com uma ação judicial contra a UNIMED Santa Catarina porque o plano de saúde se recusou a cobrir o tratamento que o seu médico indicou para as dores crônicas que você enfrenta há 8 anos.</w:t>
       </w:r>
     </w:p>
     <w:p>
       <w:pPr>
         <w:spacing w:before="0" w:after="120"/>
-        <w:jc w:val="left"/>
+        <w:jc w:val="both"/>
       </w:pPr>
       <w:r>
         <w:rPr>
           <w:rFonts w:ascii="Quattrocento Sans" w:hAnsi="Quattrocento Sans"/>
           <w:b w:val="0"/>
           <w:i w:val="0"/>
+          <w:color w:val="000000"/>
           <w:sz w:val="24"/>
         </w:rPr>
-        <w:t>O tratamento pedido e um implante chamado DRG-S (Estimulador do Ganglio da Raiz Dorsal), indicado pelo Dr. Luan Lucena (CRM/SC 20.615). Esse equipamento e colocado proximo a coluna e envia sinais eletricos que reduzem a percepcao da dor de forma significativa. Ele e indicado para casos como o seu, em que outros tratamentos nao funcionaram.</w:t>
+        <w:t>O tratamento pedido é um implante chamado DRG-S (Estimulador do Gânglio da Raiz Dorsal), indicado pelo Dr. Luan Lucena (CRM/SC 20.615). Esse equipamento é colocado próximo à coluna e envia sinais elétricos que reduzem a percepção da dor de forma significativa. Ele é indicado para casos como o seu, em que outros tratamentos não funcionaram.</w:t>
       </w:r>
     </w:p>
     <w:p>
       <w:pPr>
         <w:spacing w:before="0" w:after="200"/>
-        <w:jc w:val="left"/>
+        <w:jc w:val="both"/>
       </w:pPr>
       <w:r>
         <w:rPr>
           <w:rFonts w:ascii="Quattrocento Sans" w:hAnsi="Quattrocento Sans"/>
           <w:b w:val="0"/>
           <w:i w:val="0"/>
+          <w:color w:val="000000"/>
           <w:sz w:val="24"/>
         </w:rPr>
-        <w:t>Voce ja tentou 9 medicamentos diferentes e passou por uma cirurgia de resseccao de costela em 2025 — nenhuma dessas alternativas resolveu o problema. Por isso, este implante representa a opcao mais indicada para melhorar a sua qualidade de vida.</w:t>
+        <w:t>Você já tentou 9 medicamentos diferentes e passou por uma cirurgia de ressecção de costela em 2025 — nenhuma dessas alternativas resolveu o problema. Por isso, este implante representa a opção mais indicada para melhorar a sua qualidade de vida.</w:t>
       </w:r>
     </w:p>
     <w:p>
       <w:pPr>
-        <w:spacing w:before="240" w:after="80"/>
-        <w:jc w:val="left"/>
+        <w:spacing w:before="280" w:after="80"/>
+        <w:jc w:val="both"/>
       </w:pPr>
       <w:r>
         <w:rPr>
           <w:rFonts w:ascii="Quattrocento Sans" w:hAnsi="Quattrocento Sans"/>
           <w:b/>
           <w:i w:val="0"/>
-          <w:color w:val="312E81"/>
+          <w:color w:val="000000"/>
           <w:sz w:val="26"/>
         </w:rPr>
-        <w:t>2. O QUE ACONTECEU ATE AGORA</w:t>
+        <w:t>2. O QUE ACONTECEU ATÉ AGORA</w:t>
       </w:r>
     </w:p>
     <w:p>
       <w:pPr>
         <w:spacing w:before="0" w:after="40"/>
-        <w:jc w:val="left"/>
+        <w:jc w:val="both"/>
       </w:pPr>
       <w:r>
         <w:rPr>
           <w:rFonts w:ascii="Quattrocento Sans" w:hAnsi="Quattrocento Sans"/>
           <w:b/>
           <w:i w:val="0"/>
-          <w:color w:val="312E81"/>
+          <w:color w:val="000000"/>
           <w:sz w:val="22"/>
         </w:rPr>
-        <w:t>05 de maio de 2026 — Acao ajuizada</w:t>
+        <w:t>05 de maio de 2026 — Ação ajuizada</w:t>
       </w:r>
     </w:p>
     <w:p>
       <w:pPr>
         <w:spacing w:before="0" w:after="160"/>
-        <w:jc w:val="left"/>
+        <w:jc w:val="both"/>
       </w:pPr>
       <w:r>
         <w:rPr>
           <w:rFonts w:ascii="Quattrocento Sans" w:hAnsi="Quattrocento Sans"/>
           <w:b w:val="0"/>
           <w:i w:val="0"/>
+          <w:color w:val="000000"/>
           <w:sz w:val="24"/>
         </w:rPr>
-        <w:t>Demos entrada na acao na 2a Vara Civel de Chapeco, pedindo que a Unimed seja obrigada a custear o seu tratamento. Junto com a acao, pedimos uma decisao de urgencia para que a Unimed autorizasse o implante imediatamente, sem esperar o fim do processo.</w:t>
+        <w:t>Demos entrada na ação na 2ª Vara Cível de Chapecó, pedindo que a Unimed seja obrigada a custear o seu tratamento. Junto com a ação, pedimos uma decisão de urgência para que a Unimed autorizasse o implante imediatamente, sem esperar o fim do processo.</w:t>
       </w:r>
     </w:p>
     <w:p>
       <w:pPr>
         <w:spacing w:before="0" w:after="40"/>
-        <w:jc w:val="left"/>
+        <w:jc w:val="both"/>
       </w:pPr>
       <w:r>
         <w:rPr>
           <w:rFonts w:ascii="Quattrocento Sans" w:hAnsi="Quattrocento Sans"/>
           <w:b/>
           <w:i w:val="0"/>
-          <w:color w:val="B43C3C"/>
+          <w:color w:val="000000"/>
           <w:sz w:val="22"/>
         </w:rPr>
-        <w:t>Decisao sobre o pedido de urgencia — Negada</w:t>
+        <w:t>Decisão sobre o pedido de urgência — Indeferida</w:t>
       </w:r>
     </w:p>
     <w:p>
       <w:pPr>
         <w:spacing w:before="0" w:after="160"/>
-        <w:jc w:val="left"/>
+        <w:jc w:val="both"/>
       </w:pPr>
       <w:r>
         <w:rPr>
           <w:rFonts w:ascii="Quattrocento Sans" w:hAnsi="Quattrocento Sans"/>
           <w:b w:val="0"/>
           <w:i w:val="0"/>
+          <w:color w:val="000000"/>
           <w:sz w:val="24"/>
         </w:rPr>
-        <w:t>O juiz analisou o pedido de urgencia e, por ora, nao autorizou o tratamento imediato. Isso nao significa que voce perdeu o caso — significa apenas que o juiz entendeu que precisa de mais tempo e documentos para tomar essa decisao. O processo principal continua normalmente.</w:t>
+        <w:t>O juiz analisou o pedido de urgência e, por ora, não autorizou o tratamento imediato. Isso não significa que você perdeu o caso — significa apenas que o juiz entendeu que precisa de mais tempo e documentos para tomar essa decisão. O processo principal continua normalmente.</w:t>
       </w:r>
     </w:p>
     <w:p>
       <w:pPr>
         <w:spacing w:before="0" w:after="40"/>
-        <w:jc w:val="left"/>
+        <w:jc w:val="both"/>
       </w:pPr>
       <w:r>
         <w:rPr>
           <w:rFonts w:ascii="Quattrocento Sans" w:hAnsi="Quattrocento Sans"/>
           <w:b/>
           <w:i w:val="0"/>
-          <w:color w:val="B47800"/>
+          <w:color w:val="000000"/>
           <w:sz w:val="22"/>
         </w:rPr>
-        <w:t>Recurso interposto no Tribunal — Em analise</w:t>
+        <w:t>Recurso interposto no Tribunal — Em análise</w:t>
       </w:r>
     </w:p>
     <w:p>
       <w:pPr>
         <w:spacing w:before="0" w:after="200"/>
-        <w:jc w:val="left"/>
+        <w:jc w:val="both"/>
       </w:pPr>
       <w:r>
         <w:rPr>
           <w:rFonts w:ascii="Quattrocento Sans" w:hAnsi="Quattrocento Sans"/>
           <w:b w:val="0"/>
           <w:i w:val="0"/>
+          <w:color w:val="000000"/>
           <w:sz w:val="24"/>
         </w:rPr>
-        <w:t>Recorremos da decisao do juiz junto ao Tribunal de Justica de Santa Catarina (TJSC). Esse recurso tem o numero 5043252-17.2026.8.24.0000 e esta sendo analisado por desembargadores (juizes do tribunal). Com esse recurso, pedimos que o Tribunal autorize o tratamento de forma urgente, enquanto o processo principal ainda tramita.</w:t>
+        <w:t>Recorremos da decisão do juiz junto ao Tribunal de Justiça de Santa Catarina (TJSC). Esse recurso tem o número 5043252-17.2026.8.24.0000 e está sendo analisado por desembargadores (juízes do tribunal). Com esse recurso, pedimos que o Tribunal autorize o tratamento de forma urgente, enquanto o processo principal ainda tramita.</w:t>
       </w:r>
     </w:p>
     <w:p>
       <w:pPr>
-        <w:spacing w:before="240" w:after="80"/>
-        <w:jc w:val="left"/>
+        <w:spacing w:before="280" w:after="80"/>
+        <w:jc w:val="both"/>
       </w:pPr>
       <w:r>
         <w:rPr>
           <w:rFonts w:ascii="Quattrocento Sans" w:hAnsi="Quattrocento Sans"/>
           <w:b/>
           <w:i w:val="0"/>
-          <w:color w:val="312E81"/>
+          <w:color w:val="000000"/>
           <w:sz w:val="26"/>
         </w:rPr>
         <w:t>3. ONDE ESTAMOS AGORA</w:t>
@@ -361,92 +365,100 @@
     <w:p>
       <w:pPr>
         <w:spacing w:before="0" w:after="80"/>
-        <w:jc w:val="left"/>
+        <w:jc w:val="both"/>
       </w:pPr>
       <w:r>
         <w:rPr>
           <w:rFonts w:ascii="Quattrocento Sans" w:hAnsi="Quattrocento Sans"/>
           <w:b w:val="0"/>
           <w:i w:val="0"/>
+          <w:color w:val="000000"/>
           <w:sz w:val="24"/>
         </w:rPr>
-        <w:t>Seu caso esta em dois lugares ao mesmo tempo:</w:t>
+        <w:t>Seu caso está em dois lugares ao mesmo tempo:</w:t>
       </w:r>
     </w:p>
     <w:p>
       <w:pPr>
         <w:spacing w:after="80"/>
         <w:ind w:left="567"/>
+        <w:jc w:val="both"/>
       </w:pPr>
       <w:r>
         <w:rPr>
           <w:rFonts w:ascii="Quattrocento Sans" w:hAnsi="Quattrocento Sans"/>
           <w:b/>
           <w:i w:val="0"/>
+          <w:color w:val="000000"/>
           <w:sz w:val="24"/>
         </w:rPr>
-        <w:t xml:space="preserve">Na 2a Vara Civel de Chapeco: </w:t>
+        <w:t xml:space="preserve">Na 2ª Vara Cível de Chapecó: </w:t>
       </w:r>
       <w:r>
         <w:rPr>
           <w:rFonts w:ascii="Quattrocento Sans" w:hAnsi="Quattrocento Sans"/>
           <w:b w:val="0"/>
           <w:i w:val="0"/>
+          <w:color w:val="000000"/>
           <w:sz w:val="24"/>
         </w:rPr>
-        <w:t>o processo principal segue em andamento. A Unimed sera chamada a se defender.</w:t>
+        <w:t>o processo principal segue em andamento. A Unimed será chamada a se defender.</w:t>
       </w:r>
     </w:p>
     <w:p>
       <w:pPr>
-        <w:spacing w:after="200"/>
+        <w:spacing w:after="160"/>
         <w:ind w:left="567"/>
+        <w:jc w:val="both"/>
       </w:pPr>
       <w:r>
         <w:rPr>
           <w:rFonts w:ascii="Quattrocento Sans" w:hAnsi="Quattrocento Sans"/>
           <w:b/>
           <w:i w:val="0"/>
+          <w:color w:val="000000"/>
           <w:sz w:val="24"/>
         </w:rPr>
-        <w:t xml:space="preserve">No Tribunal de Justica (TJSC): </w:t>
+        <w:t xml:space="preserve">No Tribunal de Justiça (TJSC): </w:t>
       </w:r>
       <w:r>
         <w:rPr>
           <w:rFonts w:ascii="Quattrocento Sans" w:hAnsi="Quattrocento Sans"/>
           <w:b w:val="0"/>
           <w:i w:val="0"/>
+          <w:color w:val="000000"/>
           <w:sz w:val="24"/>
         </w:rPr>
-        <w:t>o recurso que interpusemos esta aguardando analise. Estamos acompanhando de perto.</w:t>
+        <w:t>o recurso que interpusemos está aguardando análise. Estamos acompanhando de perto.</w:t>
       </w:r>
     </w:p>
     <w:p>
       <w:pPr>
         <w:spacing w:before="0" w:after="200"/>
-        <w:jc w:val="left"/>
+        <w:jc w:val="both"/>
       </w:pPr>
       <w:r>
         <w:rPr>
           <w:rFonts w:ascii="Quattrocento Sans" w:hAnsi="Quattrocento Sans"/>
           <w:b w:val="0"/>
           <w:i w:val="0"/>
+          <w:color w:val="000000"/>
           <w:sz w:val="24"/>
         </w:rPr>
-        <w:t>Estamos acompanhando os dois ao mesmo tempo e voce sera avisada assim que houver qualquer novidade.</w:t>
+        <w:t>Estamos acompanhando os dois ao mesmo tempo e você será avisada assim que houver qualquer novidade.</w:t>
       </w:r>
     </w:p>
     <w:p>
       <w:pPr>
-        <w:spacing w:before="240" w:after="80"/>
-        <w:jc w:val="left"/>
+        <w:spacing w:before="280" w:after="80"/>
+        <w:jc w:val="both"/>
       </w:pPr>
       <w:r>
         <w:rPr>
           <w:rFonts w:ascii="Quattrocento Sans" w:hAnsi="Quattrocento Sans"/>
           <w:b/>
           <w:i w:val="0"/>
-          <w:color w:val="312E81"/>
+          <w:color w:val="000000"/>
           <w:sz w:val="26"/>
         </w:rPr>
         <w:t>4. O QUE PODE ACONTECER A SEGUIR</w:t>
@@ -456,63 +468,68 @@
       <w:pPr>
         <w:spacing w:after="120"/>
         <w:ind w:left="567"/>
+        <w:jc w:val="both"/>
       </w:pPr>
       <w:r>
         <w:rPr>
           <w:rFonts w:ascii="Quattrocento Sans" w:hAnsi="Quattrocento Sans"/>
           <w:b/>
           <w:i w:val="0"/>
-          <w:color w:val="00783C"/>
+          <w:color w:val="000000"/>
           <w:sz w:val="24"/>
         </w:rPr>
-        <w:t xml:space="preserve">Melhor cenario: </w:t>
+        <w:t xml:space="preserve">Melhor cenário: </w:t>
       </w:r>
       <w:r>
         <w:rPr>
           <w:rFonts w:ascii="Quattrocento Sans" w:hAnsi="Quattrocento Sans"/>
           <w:b w:val="0"/>
           <w:i w:val="0"/>
+          <w:color w:val="000000"/>
           <w:sz w:val="24"/>
         </w:rPr>
-        <w:t>O Tribunal aceita o recurso e autoriza o tratamento ainda durante o processo. Isso forcaria a Unimed a custear o implante imediatamente.</w:t>
+        <w:t>O Tribunal aceita o recurso e autoriza o tratamento ainda durante o processo. Isso forçaria a Unimed a custear o implante imediatamente.</w:t>
       </w:r>
     </w:p>
     <w:p>
       <w:pPr>
         <w:spacing w:after="120"/>
         <w:ind w:left="567"/>
+        <w:jc w:val="both"/>
       </w:pPr>
       <w:r>
         <w:rPr>
           <w:rFonts w:ascii="Quattrocento Sans" w:hAnsi="Quattrocento Sans"/>
           <w:b/>
           <w:i w:val="0"/>
-          <w:color w:val="B47800"/>
+          <w:color w:val="000000"/>
           <w:sz w:val="24"/>
         </w:rPr>
-        <w:t xml:space="preserve">Cenario intermediario: </w:t>
+        <w:t xml:space="preserve">Cenário intermediário: </w:t>
       </w:r>
       <w:r>
         <w:rPr>
           <w:rFonts w:ascii="Quattrocento Sans" w:hAnsi="Quattrocento Sans"/>
           <w:b w:val="0"/>
           <w:i w:val="0"/>
+          <w:color w:val="000000"/>
           <w:sz w:val="24"/>
         </w:rPr>
-        <w:t>O Tribunal nao autoriza agora, mas o processo principal continua. Nesse caso, vamos reunir mais provas e seguir apresentando argumentos ao juiz.</w:t>
+        <w:t>O Tribunal não autoriza agora, mas o processo principal continua. Nesse caso, vamos reunir mais provas e seguir apresentando argumentos ao juiz.</w:t>
       </w:r>
     </w:p>
     <w:p>
       <w:pPr>
         <w:spacing w:after="200"/>
         <w:ind w:left="567"/>
+        <w:jc w:val="both"/>
       </w:pPr>
       <w:r>
         <w:rPr>
           <w:rFonts w:ascii="Quattrocento Sans" w:hAnsi="Quattrocento Sans"/>
           <w:b/>
           <w:i w:val="0"/>
-          <w:color w:val="312E81"/>
+          <w:color w:val="000000"/>
           <w:sz w:val="24"/>
         </w:rPr>
         <w:t xml:space="preserve">Importante: </w:t>
@@ -522,98 +539,104 @@
           <w:rFonts w:ascii="Quattrocento Sans" w:hAnsi="Quattrocento Sans"/>
           <w:b w:val="0"/>
           <w:i w:val="0"/>
+          <w:color w:val="000000"/>
           <w:sz w:val="24"/>
         </w:rPr>
-        <w:t>Mesmo sem a autorizacao de urgencia, a acao principal segue firme. Temos bons argumentos e documentacao medica robusta. O processo ainda pode ser ganho ao final.</w:t>
+        <w:t>Mesmo sem a autorização de urgência, a ação principal segue firme. Temos bons argumentos e documentação médica robusta. O processo ainda pode ser ganho ao final.</w:t>
       </w:r>
     </w:p>
     <w:p>
       <w:pPr>
-        <w:spacing w:before="240" w:after="80"/>
-        <w:jc w:val="left"/>
+        <w:spacing w:before="280" w:after="80"/>
+        <w:jc w:val="both"/>
       </w:pPr>
       <w:r>
         <w:rPr>
           <w:rFonts w:ascii="Quattrocento Sans" w:hAnsi="Quattrocento Sans"/>
           <w:b/>
           <w:i w:val="0"/>
-          <w:color w:val="312E81"/>
+          <w:color w:val="000000"/>
           <w:sz w:val="26"/>
         </w:rPr>
-        <w:t>5. O QUE PRECISAMOS DE VOCE AGORA</w:t>
+        <w:t>5. O QUE PRECISAMOS DE VOCÊ AGORA</w:t>
       </w:r>
     </w:p>
     <w:p>
       <w:pPr>
         <w:spacing w:before="0" w:after="120"/>
-        <w:jc w:val="left"/>
+        <w:jc w:val="both"/>
       </w:pPr>
       <w:r>
         <w:rPr>
           <w:rFonts w:ascii="Quattrocento Sans" w:hAnsi="Quattrocento Sans"/>
           <w:b w:val="0"/>
           <w:i w:val="0"/>
+          <w:color w:val="000000"/>
           <w:sz w:val="24"/>
         </w:rPr>
-        <w:t>Por enquanto, nao precisamos de nada de voce. Fique tranquila e aguarde nosso contato.</w:t>
+        <w:t>Por enquanto, não precisamos de nada de você. Fique tranquila e aguarde nosso contato.</w:t>
       </w:r>
     </w:p>
     <w:p>
       <w:pPr>
         <w:spacing w:before="0" w:after="200"/>
-        <w:jc w:val="left"/>
+        <w:jc w:val="both"/>
       </w:pPr>
       <w:r>
         <w:rPr>
           <w:rFonts w:ascii="Quattrocento Sans" w:hAnsi="Quattrocento Sans"/>
           <w:b w:val="0"/>
           <w:i w:val="0"/>
+          <w:color w:val="000000"/>
           <w:sz w:val="24"/>
         </w:rPr>
-        <w:t>Mas, caso receba qualquer correspondencia, e-mail ou ligacao da Unimed ou do tribunal sobre esse processo, nos avise imediatamente antes de responder ou assinar qualquer coisa.</w:t>
+        <w:t>Porém, caso receba qualquer correspondência, e-mail ou ligação da Unimed ou do tribunal sobre esse processo, nos avise imediatamente antes de responder ou assinar qualquer coisa.</w:t>
       </w:r>
     </w:p>
     <w:p>
       <w:pPr>
-        <w:spacing w:before="240" w:after="80"/>
-        <w:jc w:val="left"/>
+        <w:spacing w:before="280" w:after="80"/>
+        <w:jc w:val="both"/>
       </w:pPr>
       <w:r>
         <w:rPr>
           <w:rFonts w:ascii="Quattrocento Sans" w:hAnsi="Quattrocento Sans"/>
           <w:b/>
           <w:i w:val="0"/>
-          <w:color w:val="312E81"/>
+          <w:color w:val="000000"/>
           <w:sz w:val="26"/>
         </w:rPr>
-        <w:t>6. FICOU COM DUVIDAS?</w:t>
+        <w:t>6. FICOU COM DÚVIDAS?</w:t>
       </w:r>
     </w:p>
     <w:p>
       <w:pPr>
         <w:spacing w:before="0" w:after="120"/>
-        <w:jc w:val="left"/>
+        <w:jc w:val="both"/>
       </w:pPr>
       <w:r>
         <w:rPr>
           <w:rFonts w:ascii="Quattrocento Sans" w:hAnsi="Quattrocento Sans"/>
           <w:b w:val="0"/>
           <w:i w:val="0"/>
+          <w:color w:val="000000"/>
           <w:sz w:val="24"/>
         </w:rPr>
-        <w:t>Estamos a disposicao para conversar sempre que precisar:</w:t>
+        <w:t>Estamos à disposição para conversar sempre que precisar:</w:t>
       </w:r>
     </w:p>
     <w:p>
       <w:pPr>
         <w:spacing w:after="60"/>
         <w:ind w:left="567"/>
+        <w:jc w:val="both"/>
       </w:pPr>
       <w:r>
         <w:rPr>
           <w:rFonts w:ascii="Quattrocento Sans" w:hAnsi="Quattrocento Sans"/>
           <w:b w:val="0"/>
           <w:i w:val="0"/>
+          <w:color w:val="000000"/>
           <w:sz w:val="24"/>
         </w:rPr>
         <w:t>WhatsApp: (49) 98806-1881</w:t>
@@ -623,12 +646,14 @@
       <w:pPr>
         <w:spacing w:after="60"/>
         <w:ind w:left="567"/>
+        <w:jc w:val="both"/>
       </w:pPr>
       <w:r>
         <w:rPr>
           <w:rFonts w:ascii="Quattrocento Sans" w:hAnsi="Quattrocento Sans"/>
           <w:b w:val="0"/>
           <w:i w:val="0"/>
+          <w:color w:val="000000"/>
           <w:sz w:val="24"/>
         </w:rPr>
         <w:t>E-mail: admflavianecaler@gmail.com</w:t>
@@ -638,33 +663,30 @@
       <w:pPr>
         <w:spacing w:after="60"/>
         <w:ind w:left="567"/>
+        <w:jc w:val="both"/>
       </w:pPr>
       <w:r>
         <w:rPr>
           <w:rFonts w:ascii="Quattrocento Sans" w:hAnsi="Quattrocento Sans"/>
           <w:b w:val="0"/>
           <w:i w:val="0"/>
+          <w:color w:val="000000"/>
           <w:sz w:val="24"/>
         </w:rPr>
-        <w:t>Escritorio: Fernando Machado, 141-E, Sala 1001 — Edificio IL Centenario, Chapeco/SC</w:t>
+        <w:t>Endereço: Fernando Machado, 141-E, Sala 1001 — Edifício IL Centenário, Chapecó/SC</w:t>
       </w:r>
     </w:p>
     <w:p>
       <w:pPr>
-        <w:spacing w:before="40" w:after="40"/>
+        <w:spacing w:before="40" w:after="120"/>
+        <w:pBdr>
+          <w:bottom w:val="single" w:sz="6" w:space="1" w:color="000000"/>
+        </w:pBdr>
       </w:pPr>
-      <w:r>
-        <w:rPr>
-          <w:rFonts w:ascii="Quattrocento Sans" w:hAnsi="Quattrocento Sans"/>
-          <w:color w:val="B4B4C8"/>
-          <w:sz w:val="18"/>
-        </w:rPr>
-        <w:t>________________________________________________________________________________</w:t>
-      </w:r>
     </w:p>
     <w:p>
       <w:pPr>
-        <w:spacing w:before="200" w:after="80"/>
+        <w:spacing w:before="200" w:after="120"/>
         <w:jc w:val="center"/>
       </w:pPr>
       <w:r>
@@ -672,6 +694,7 @@
           <w:rFonts w:ascii="Quattrocento Sans" w:hAnsi="Quattrocento Sans"/>
           <w:b w:val="0"/>
           <w:i/>
+          <w:color w:val="000000"/>
           <w:sz w:val="24"/>
         </w:rPr>
         <w:t>Com respeito e comprometimento,</w:t>
@@ -687,7 +710,7 @@
           <w:rFonts w:ascii="Quattrocento Sans" w:hAnsi="Quattrocento Sans"/>
           <w:b/>
           <w:i w:val="0"/>
-          <w:color w:val="312E81"/>
+          <w:color w:val="000000"/>
           <w:sz w:val="26"/>
         </w:rPr>
         <w:t>Flaviane Bilhar Caler</w:t>
@@ -703,7 +726,7 @@
           <w:rFonts w:ascii="Quattrocento Sans" w:hAnsi="Quattrocento Sans"/>
           <w:b w:val="0"/>
           <w:i/>
-          <w:color w:val="646478"/>
+          <w:color w:val="000000"/>
           <w:sz w:val="20"/>
         </w:rPr>
         <w:t>Advogada — OAB/SC 54.395</w:t>
@@ -719,15 +742,15 @@
           <w:rFonts w:ascii="Quattrocento Sans" w:hAnsi="Quattrocento Sans"/>
           <w:b w:val="0"/>
           <w:i w:val="0"/>
-          <w:color w:val="78648C"/>
+          <w:color w:val="000000"/>
           <w:sz w:val="20"/>
         </w:rPr>
-        <w:t>Direito da Saude e Direito Previdenciario</w:t>
+        <w:t>Direito da Saúde e Direito Previdenciário</w:t>
       </w:r>
     </w:p>
     <w:sectPr>
       <w:pgSz w:w="12240" w:h="15840"/>
-      <w:pgMar w:top="1417" w:right="1417" w:bottom="1417" w:left="1701" w:header="720" w:footer="720" w:gutter="0"/>
+      <w:pgMar w:top="850" w:right="1417" w:bottom="1134" w:left="1701" w:header="720" w:footer="720" w:gutter="0"/>
       <w:cols w:space="720"/>
       <w:docGrid w:linePitch="360"/>
     </w:sectPr>

</xml_diff>

<commit_message>
docs: relatório Gabriela com timbrado original preservado via repack do docx
Co-Authored-By: Claude Sonnet 4.6 <noreply@anthropic.com>
Claude-Session: https://claude.ai/code/session_01NdDMccMpiwCWb3jB9T1LmE
</commit_message>
<xml_diff>
--- a/Relatorio_Gabriela_Dal_Santo.docx
+++ b/Relatorio_Gabriela_Dal_Santo.docx
@@ -4,64 +4,61 @@
   <w:body>
     <w:p>
       <w:pPr>
+        <w:jc w:val="center"/>
         <w:spacing w:before="0" w:after="60"/>
+      </w:pPr>
+      <w:r>
+        <w:rPr>
+          <w:rFonts w:ascii="Quattrocento Sans" w:hAnsi="Quattrocento Sans"/>
+          <w:sz w:val="26"/>
+          <w:szCs w:val="26"/>
+          <w:color w:val="000000"/>
+          <w:b/>
+        </w:rPr>
+        <w:t>RELATÓRIO DE ANDAMENTO DO CASO</w:t>
+      </w:r>
+    </w:p>
+    <w:p>
+      <w:pPr>
         <w:jc w:val="center"/>
-      </w:pPr>
-      <w:r>
-        <w:rPr>
-          <w:rFonts w:ascii="Quattrocento Sans" w:hAnsi="Quattrocento Sans"/>
-          <w:b/>
-          <w:i w:val="0"/>
-          <w:color w:val="000000"/>
-          <w:sz w:val="26"/>
-        </w:rPr>
-        <w:t>RELATÓRIO DE ANDAMENTO DO CASO</w:t>
-      </w:r>
-    </w:p>
-    <w:p>
-      <w:pPr>
         <w:spacing w:before="0" w:after="40"/>
+      </w:pPr>
+      <w:r>
+        <w:rPr>
+          <w:rFonts w:ascii="Quattrocento Sans" w:hAnsi="Quattrocento Sans"/>
+          <w:sz w:val="22"/>
+          <w:szCs w:val="22"/>
+          <w:color w:val="000000"/>
+        </w:rPr>
+        <w:t>Cliente: Gabriela Dal Santo</w:t>
+      </w:r>
+    </w:p>
+    <w:p>
+      <w:pPr>
         <w:jc w:val="center"/>
-      </w:pPr>
-      <w:r>
-        <w:rPr>
-          <w:rFonts w:ascii="Quattrocento Sans" w:hAnsi="Quattrocento Sans"/>
-          <w:b w:val="0"/>
-          <w:i w:val="0"/>
-          <w:color w:val="000000"/>
+        <w:spacing w:before="0" w:after="40"/>
+      </w:pPr>
+      <w:r>
+        <w:rPr>
+          <w:rFonts w:ascii="Quattrocento Sans" w:hAnsi="Quattrocento Sans"/>
           <w:sz w:val="22"/>
-        </w:rPr>
-        <w:t>Cliente: Gabriela Dal Santo</w:t>
-      </w:r>
-    </w:p>
-    <w:p>
-      <w:pPr>
-        <w:spacing w:before="0" w:after="40"/>
+          <w:szCs w:val="22"/>
+          <w:color w:val="000000"/>
+        </w:rPr>
+        <w:t>Data: 21 de junho de 2026</w:t>
+      </w:r>
+    </w:p>
+    <w:p>
+      <w:pPr>
         <w:jc w:val="center"/>
-      </w:pPr>
-      <w:r>
-        <w:rPr>
-          <w:rFonts w:ascii="Quattrocento Sans" w:hAnsi="Quattrocento Sans"/>
-          <w:b w:val="0"/>
-          <w:i w:val="0"/>
-          <w:color w:val="000000"/>
-          <w:sz w:val="22"/>
-        </w:rPr>
-        <w:t>Data: 21 de junho de 2026</w:t>
-      </w:r>
-    </w:p>
-    <w:p>
-      <w:pPr>
-        <w:spacing w:before="0" w:after="160"/>
-        <w:jc w:val="center"/>
-      </w:pPr>
-      <w:r>
-        <w:rPr>
-          <w:rFonts w:ascii="Quattrocento Sans" w:hAnsi="Quattrocento Sans"/>
-          <w:b w:val="0"/>
-          <w:i w:val="0"/>
-          <w:color w:val="000000"/>
+        <w:spacing w:before="0" w:after="200"/>
+      </w:pPr>
+      <w:r>
+        <w:rPr>
+          <w:rFonts w:ascii="Quattrocento Sans" w:hAnsi="Quattrocento Sans"/>
           <w:sz w:val="20"/>
+          <w:szCs w:val="20"/>
+          <w:color w:val="000000"/>
         </w:rPr>
         <w:t>Processo nº 5012537-35.2026.8.24.0018</w:t>
       </w:r>
@@ -76,512 +73,502 @@
     </w:p>
     <w:p>
       <w:pPr>
-        <w:spacing w:before="280" w:after="80"/>
         <w:jc w:val="both"/>
-      </w:pPr>
-      <w:r>
-        <w:rPr>
-          <w:rFonts w:ascii="Quattrocento Sans" w:hAnsi="Quattrocento Sans"/>
+        <w:spacing w:before="240" w:after="80"/>
+      </w:pPr>
+      <w:r>
+        <w:rPr>
+          <w:rFonts w:ascii="Quattrocento Sans" w:hAnsi="Quattrocento Sans"/>
+          <w:sz w:val="24"/>
+          <w:szCs w:val="24"/>
+          <w:color w:val="000000"/>
           <w:b/>
-          <w:i w:val="0"/>
-          <w:color w:val="000000"/>
-          <w:sz w:val="24"/>
         </w:rPr>
         <w:t>1. O QUE É O SEU CASO</w:t>
       </w:r>
     </w:p>
     <w:p>
       <w:pPr>
+        <w:jc w:val="both"/>
         <w:spacing w:before="0" w:after="100"/>
+      </w:pPr>
+      <w:r>
+        <w:rPr>
+          <w:rFonts w:ascii="Quattrocento Sans" w:hAnsi="Quattrocento Sans"/>
+          <w:sz w:val="24"/>
+          <w:szCs w:val="24"/>
+          <w:color w:val="000000"/>
+        </w:rPr>
+        <w:t>Você entrou com uma ação judicial contra a UNIMED Santa Catarina porque o plano de saúde se recusou a cobrir o tratamento que o seu médico indicou para as dores crônicas que você enfrenta há 8 anos.</w:t>
+      </w:r>
+    </w:p>
+    <w:p>
+      <w:pPr>
         <w:jc w:val="both"/>
-      </w:pPr>
-      <w:r>
-        <w:rPr>
-          <w:rFonts w:ascii="Quattrocento Sans" w:hAnsi="Quattrocento Sans"/>
-          <w:b w:val="0"/>
-          <w:i w:val="0"/>
-          <w:color w:val="000000"/>
-          <w:sz w:val="24"/>
-        </w:rPr>
-        <w:t>Você entrou com uma ação judicial contra a UNIMED Santa Catarina porque o plano de saúde se recusou a cobrir o tratamento que o seu médico indicou para as dores crônicas que você enfrenta há 8 anos.</w:t>
-      </w:r>
-    </w:p>
-    <w:p>
-      <w:pPr>
         <w:spacing w:before="0" w:after="100"/>
+      </w:pPr>
+      <w:r>
+        <w:rPr>
+          <w:rFonts w:ascii="Quattrocento Sans" w:hAnsi="Quattrocento Sans"/>
+          <w:sz w:val="24"/>
+          <w:szCs w:val="24"/>
+          <w:color w:val="000000"/>
+        </w:rPr>
+        <w:t>O tratamento pedido é um implante chamado DRG-S (Estimulador do Gânglio da Raiz Dorsal), indicado pelo Dr. Luan Lucena (CRM/SC 20.615). Esse equipamento é colocado próximo à coluna e envia sinais elétricos que reduzem a percepção da dor de forma significativa. Ele é indicado para casos como o seu, em que outros tratamentos não funcionaram.</w:t>
+      </w:r>
+    </w:p>
+    <w:p>
+      <w:pPr>
         <w:jc w:val="both"/>
-      </w:pPr>
-      <w:r>
-        <w:rPr>
-          <w:rFonts w:ascii="Quattrocento Sans" w:hAnsi="Quattrocento Sans"/>
-          <w:b w:val="0"/>
-          <w:i w:val="0"/>
-          <w:color w:val="000000"/>
-          <w:sz w:val="24"/>
-        </w:rPr>
-        <w:t>O tratamento pedido é um implante chamado DRG-S (Estimulador do Gânglio da Raiz Dorsal), indicado pelo Dr. Luan Lucena (CRM/SC 20.615). Esse equipamento é colocado próximo à coluna e envia sinais elétricos que reduzem a percepção da dor de forma significativa. Ele é indicado para casos como o seu, em que outros tratamentos não funcionaram.</w:t>
-      </w:r>
-    </w:p>
-    <w:p>
-      <w:pPr>
         <w:spacing w:before="0" w:after="200"/>
+      </w:pPr>
+      <w:r>
+        <w:rPr>
+          <w:rFonts w:ascii="Quattrocento Sans" w:hAnsi="Quattrocento Sans"/>
+          <w:sz w:val="24"/>
+          <w:szCs w:val="24"/>
+          <w:color w:val="000000"/>
+        </w:rPr>
+        <w:t>Você já tentou 9 medicamentos diferentes e passou por uma cirurgia de ressecção de costela em 2025 — nenhuma dessas alternativas resolveu o problema. Por isso, este implante representa a opção mais indicada para melhorar a sua qualidade de vida.</w:t>
+      </w:r>
+    </w:p>
+    <w:p>
+      <w:pPr>
         <w:jc w:val="both"/>
-      </w:pPr>
-      <w:r>
-        <w:rPr>
-          <w:rFonts w:ascii="Quattrocento Sans" w:hAnsi="Quattrocento Sans"/>
-          <w:b w:val="0"/>
-          <w:i w:val="0"/>
-          <w:color w:val="000000"/>
-          <w:sz w:val="24"/>
-        </w:rPr>
-        <w:t>Você já tentou 9 medicamentos diferentes e passou por uma cirurgia de ressecção de costela em 2025 — nenhuma dessas alternativas resolveu o problema. Por isso, este implante representa a opção mais indicada para melhorar a sua qualidade de vida.</w:t>
-      </w:r>
-    </w:p>
-    <w:p>
-      <w:pPr>
-        <w:spacing w:before="280" w:after="80"/>
+        <w:spacing w:before="240" w:after="80"/>
+      </w:pPr>
+      <w:r>
+        <w:rPr>
+          <w:rFonts w:ascii="Quattrocento Sans" w:hAnsi="Quattrocento Sans"/>
+          <w:sz w:val="24"/>
+          <w:szCs w:val="24"/>
+          <w:color w:val="000000"/>
+          <w:b/>
+        </w:rPr>
+        <w:t>2. O QUE ACONTECEU ATÉ AGORA</w:t>
+      </w:r>
+    </w:p>
+    <w:p>
+      <w:pPr>
         <w:jc w:val="both"/>
-      </w:pPr>
-      <w:r>
-        <w:rPr>
-          <w:rFonts w:ascii="Quattrocento Sans" w:hAnsi="Quattrocento Sans"/>
+        <w:spacing w:before="0" w:after="40"/>
+      </w:pPr>
+      <w:r>
+        <w:rPr>
+          <w:rFonts w:ascii="Quattrocento Sans" w:hAnsi="Quattrocento Sans"/>
+          <w:sz w:val="22"/>
+          <w:szCs w:val="22"/>
+          <w:color w:val="000000"/>
           <w:b/>
-          <w:i w:val="0"/>
-          <w:color w:val="000000"/>
-          <w:sz w:val="24"/>
-        </w:rPr>
-        <w:t>2. O QUE ACONTECEU ATÉ AGORA</w:t>
-      </w:r>
-    </w:p>
-    <w:p>
-      <w:pPr>
+        </w:rPr>
+        <w:t>05 de maio de 2026 — Ação ajuizada</w:t>
+      </w:r>
+    </w:p>
+    <w:p>
+      <w:pPr>
+        <w:jc w:val="both"/>
+        <w:spacing w:before="0" w:after="140"/>
+      </w:pPr>
+      <w:r>
+        <w:rPr>
+          <w:rFonts w:ascii="Quattrocento Sans" w:hAnsi="Quattrocento Sans"/>
+          <w:sz w:val="24"/>
+          <w:szCs w:val="24"/>
+          <w:color w:val="000000"/>
+        </w:rPr>
+        <w:t>Demos entrada na ação na 2ª Vara Cível de Chapecó, pedindo que a Unimed seja obrigada a custear o seu tratamento. Junto com a ação, pedimos uma decisão de urgência para que a Unimed autorizasse o implante imediatamente, sem esperar o fim do processo.</w:t>
+      </w:r>
+    </w:p>
+    <w:p>
+      <w:pPr>
+        <w:jc w:val="both"/>
         <w:spacing w:before="0" w:after="40"/>
+      </w:pPr>
+      <w:r>
+        <w:rPr>
+          <w:rFonts w:ascii="Quattrocento Sans" w:hAnsi="Quattrocento Sans"/>
+          <w:sz w:val="22"/>
+          <w:szCs w:val="22"/>
+          <w:color w:val="000000"/>
+          <w:b/>
+        </w:rPr>
+        <w:t>Decisão sobre o pedido de urgência — Indeferida</w:t>
+      </w:r>
+    </w:p>
+    <w:p>
+      <w:pPr>
         <w:jc w:val="both"/>
-      </w:pPr>
-      <w:r>
-        <w:rPr>
-          <w:rFonts w:ascii="Quattrocento Sans" w:hAnsi="Quattrocento Sans"/>
+        <w:spacing w:before="0" w:after="140"/>
+      </w:pPr>
+      <w:r>
+        <w:rPr>
+          <w:rFonts w:ascii="Quattrocento Sans" w:hAnsi="Quattrocento Sans"/>
+          <w:sz w:val="24"/>
+          <w:szCs w:val="24"/>
+          <w:color w:val="000000"/>
+        </w:rPr>
+        <w:t>O juiz analisou o pedido de urgência e, por ora, não autorizou o tratamento imediato. Isso não significa que você perdeu o caso — significa apenas que o juiz entendeu que precisa de mais tempo e documentos para tomar essa decisão. O processo principal continua normalmente.</w:t>
+      </w:r>
+    </w:p>
+    <w:p>
+      <w:pPr>
+        <w:jc w:val="both"/>
+        <w:spacing w:before="0" w:after="40"/>
+      </w:pPr>
+      <w:r>
+        <w:rPr>
+          <w:rFonts w:ascii="Quattrocento Sans" w:hAnsi="Quattrocento Sans"/>
+          <w:sz w:val="22"/>
+          <w:szCs w:val="22"/>
+          <w:color w:val="000000"/>
           <w:b/>
-          <w:i w:val="0"/>
-          <w:color w:val="000000"/>
-          <w:sz w:val="22"/>
-        </w:rPr>
-        <w:t>05 de maio de 2026 — Ação ajuizada</w:t>
-      </w:r>
-    </w:p>
-    <w:p>
-      <w:pPr>
-        <w:spacing w:before="0" w:after="140"/>
+        </w:rPr>
+        <w:t>Recurso interposto no Tribunal — Em análise</w:t>
+      </w:r>
+    </w:p>
+    <w:p>
+      <w:pPr>
         <w:jc w:val="both"/>
-      </w:pPr>
-      <w:r>
-        <w:rPr>
-          <w:rFonts w:ascii="Quattrocento Sans" w:hAnsi="Quattrocento Sans"/>
-          <w:b w:val="0"/>
-          <w:i w:val="0"/>
-          <w:color w:val="000000"/>
-          <w:sz w:val="24"/>
-        </w:rPr>
-        <w:t>Demos entrada na ação na 2ª Vara Cível de Chapecó, pedindo que a Unimed seja obrigada a custear o seu tratamento. Junto com a ação, pedimos uma decisão de urgência para que a Unimed autorizasse o implante imediatamente, sem esperar o fim do processo.</w:t>
-      </w:r>
-    </w:p>
-    <w:p>
-      <w:pPr>
-        <w:spacing w:before="0" w:after="40"/>
+        <w:spacing w:before="0" w:after="200"/>
+      </w:pPr>
+      <w:r>
+        <w:rPr>
+          <w:rFonts w:ascii="Quattrocento Sans" w:hAnsi="Quattrocento Sans"/>
+          <w:sz w:val="24"/>
+          <w:szCs w:val="24"/>
+          <w:color w:val="000000"/>
+        </w:rPr>
+        <w:t>Recorremos da decisão do juiz junto ao Tribunal de Justiça de Santa Catarina (TJSC). Esse recurso tem o número 5043252-17.2026.8.24.0000 e está sendo analisado por desembargadores (juízes do tribunal). Com esse recurso, pedimos que o Tribunal autorize o tratamento de forma urgente, enquanto o processo principal ainda tramita.</w:t>
+      </w:r>
+    </w:p>
+    <w:p>
+      <w:pPr>
         <w:jc w:val="both"/>
-      </w:pPr>
-      <w:r>
-        <w:rPr>
-          <w:rFonts w:ascii="Quattrocento Sans" w:hAnsi="Quattrocento Sans"/>
+        <w:spacing w:before="240" w:after="80"/>
+      </w:pPr>
+      <w:r>
+        <w:rPr>
+          <w:rFonts w:ascii="Quattrocento Sans" w:hAnsi="Quattrocento Sans"/>
+          <w:sz w:val="24"/>
+          <w:szCs w:val="24"/>
+          <w:color w:val="000000"/>
           <w:b/>
-          <w:i w:val="0"/>
-          <w:color w:val="000000"/>
-          <w:sz w:val="22"/>
-        </w:rPr>
-        <w:t>Decisão sobre o pedido de urgência — Indeferida</w:t>
-      </w:r>
-    </w:p>
-    <w:p>
-      <w:pPr>
-        <w:spacing w:before="0" w:after="140"/>
+        </w:rPr>
+        <w:t>3. ONDE ESTAMOS AGORA</w:t>
+      </w:r>
+    </w:p>
+    <w:p>
+      <w:pPr>
         <w:jc w:val="both"/>
-      </w:pPr>
-      <w:r>
-        <w:rPr>
-          <w:rFonts w:ascii="Quattrocento Sans" w:hAnsi="Quattrocento Sans"/>
-          <w:b w:val="0"/>
-          <w:i w:val="0"/>
-          <w:color w:val="000000"/>
-          <w:sz w:val="24"/>
-        </w:rPr>
-        <w:t>O juiz analisou o pedido de urgência e, por ora, não autorizou o tratamento imediato. Isso não significa que você perdeu o caso — significa apenas que o juiz entendeu que precisa de mais tempo e documentos para tomar essa decisão. O processo principal continua normalmente.</w:t>
-      </w:r>
-    </w:p>
-    <w:p>
-      <w:pPr>
-        <w:spacing w:before="0" w:after="40"/>
+        <w:spacing w:before="0" w:after="80"/>
+      </w:pPr>
+      <w:r>
+        <w:rPr>
+          <w:rFonts w:ascii="Quattrocento Sans" w:hAnsi="Quattrocento Sans"/>
+          <w:sz w:val="24"/>
+          <w:szCs w:val="24"/>
+          <w:color w:val="000000"/>
+        </w:rPr>
+        <w:t>Seu caso está em dois lugares ao mesmo tempo:</w:t>
+      </w:r>
+    </w:p>
+    <w:p>
+      <w:pPr>
         <w:jc w:val="both"/>
-      </w:pPr>
-      <w:r>
-        <w:rPr>
-          <w:rFonts w:ascii="Quattrocento Sans" w:hAnsi="Quattrocento Sans"/>
+        <w:spacing w:before="0" w:after="100"/>
+        <w:ind w:left="720"/>
+      </w:pPr>
+      <w:r>
+        <w:rPr>
+          <w:rFonts w:ascii="Quattrocento Sans" w:hAnsi="Quattrocento Sans"/>
+          <w:sz w:val="24"/>
+          <w:szCs w:val="24"/>
+          <w:color w:val="000000"/>
           <w:b/>
-          <w:i w:val="0"/>
-          <w:color w:val="000000"/>
-          <w:sz w:val="22"/>
-        </w:rPr>
-        <w:t>Recurso interposto no Tribunal — Em análise</w:t>
-      </w:r>
-    </w:p>
-    <w:p>
-      <w:pPr>
+        </w:rPr>
+        <w:t xml:space="preserve">Na 2ª Vara Cível de Chapecó: </w:t>
+      </w:r>
+      <w:r>
+        <w:rPr>
+          <w:rFonts w:ascii="Quattrocento Sans" w:hAnsi="Quattrocento Sans"/>
+          <w:sz w:val="24"/>
+          <w:szCs w:val="24"/>
+          <w:color w:val="000000"/>
+        </w:rPr>
+        <w:t>o processo principal segue em andamento. A Unimed será chamada a se defender.</w:t>
+      </w:r>
+    </w:p>
+    <w:p>
+      <w:pPr>
+        <w:jc w:val="both"/>
+        <w:spacing w:before="0" w:after="100"/>
+        <w:ind w:left="720"/>
+      </w:pPr>
+      <w:r>
+        <w:rPr>
+          <w:rFonts w:ascii="Quattrocento Sans" w:hAnsi="Quattrocento Sans"/>
+          <w:sz w:val="24"/>
+          <w:szCs w:val="24"/>
+          <w:color w:val="000000"/>
+          <w:b/>
+        </w:rPr>
+        <w:t xml:space="preserve">No Tribunal de Justiça (TJSC): </w:t>
+      </w:r>
+      <w:r>
+        <w:rPr>
+          <w:rFonts w:ascii="Quattrocento Sans" w:hAnsi="Quattrocento Sans"/>
+          <w:sz w:val="24"/>
+          <w:szCs w:val="24"/>
+          <w:color w:val="000000"/>
+        </w:rPr>
+        <w:t>o recurso que interpusemos está aguardando análise. Estamos acompanhando de perto.</w:t>
+      </w:r>
+    </w:p>
+    <w:p>
+      <w:pPr>
+        <w:jc w:val="both"/>
+        <w:spacing w:before="80" w:after="200"/>
+      </w:pPr>
+      <w:r>
+        <w:rPr>
+          <w:rFonts w:ascii="Quattrocento Sans" w:hAnsi="Quattrocento Sans"/>
+          <w:sz w:val="24"/>
+          <w:szCs w:val="24"/>
+          <w:color w:val="000000"/>
+        </w:rPr>
+        <w:t>Estamos acompanhando os dois ao mesmo tempo e você será avisada assim que houver qualquer novidade.</w:t>
+      </w:r>
+    </w:p>
+    <w:p>
+      <w:pPr>
+        <w:jc w:val="both"/>
+        <w:spacing w:before="240" w:after="80"/>
+      </w:pPr>
+      <w:r>
+        <w:rPr>
+          <w:rFonts w:ascii="Quattrocento Sans" w:hAnsi="Quattrocento Sans"/>
+          <w:sz w:val="24"/>
+          <w:szCs w:val="24"/>
+          <w:color w:val="000000"/>
+          <w:b/>
+        </w:rPr>
+        <w:t>4. O QUE PODE ACONTECER A SEGUIR</w:t>
+      </w:r>
+    </w:p>
+    <w:p>
+      <w:pPr>
+        <w:jc w:val="both"/>
+        <w:spacing w:before="0" w:after="100"/>
+        <w:ind w:left="720"/>
+      </w:pPr>
+      <w:r>
+        <w:rPr>
+          <w:rFonts w:ascii="Quattrocento Sans" w:hAnsi="Quattrocento Sans"/>
+          <w:sz w:val="24"/>
+          <w:szCs w:val="24"/>
+          <w:color w:val="000000"/>
+          <w:b/>
+        </w:rPr>
+        <w:t xml:space="preserve">Melhor cenário: </w:t>
+      </w:r>
+      <w:r>
+        <w:rPr>
+          <w:rFonts w:ascii="Quattrocento Sans" w:hAnsi="Quattrocento Sans"/>
+          <w:sz w:val="24"/>
+          <w:szCs w:val="24"/>
+          <w:color w:val="000000"/>
+        </w:rPr>
+        <w:t>O Tribunal aceita o recurso e autoriza o tratamento ainda durante o processo. Isso forçaria a Unimed a custear o implante imediatamente.</w:t>
+      </w:r>
+    </w:p>
+    <w:p>
+      <w:pPr>
+        <w:jc w:val="both"/>
+        <w:spacing w:before="0" w:after="100"/>
+        <w:ind w:left="720"/>
+      </w:pPr>
+      <w:r>
+        <w:rPr>
+          <w:rFonts w:ascii="Quattrocento Sans" w:hAnsi="Quattrocento Sans"/>
+          <w:sz w:val="24"/>
+          <w:szCs w:val="24"/>
+          <w:color w:val="000000"/>
+          <w:b/>
+        </w:rPr>
+        <w:t xml:space="preserve">Cenário intermediário: </w:t>
+      </w:r>
+      <w:r>
+        <w:rPr>
+          <w:rFonts w:ascii="Quattrocento Sans" w:hAnsi="Quattrocento Sans"/>
+          <w:sz w:val="24"/>
+          <w:szCs w:val="24"/>
+          <w:color w:val="000000"/>
+        </w:rPr>
+        <w:t>O Tribunal não autoriza agora, mas o processo principal continua. Nesse caso, vamos reunir mais provas e seguir apresentando argumentos ao juiz.</w:t>
+      </w:r>
+    </w:p>
+    <w:p>
+      <w:pPr>
+        <w:jc w:val="both"/>
+        <w:spacing w:before="0" w:after="100"/>
+        <w:ind w:left="720"/>
+      </w:pPr>
+      <w:r>
+        <w:rPr>
+          <w:rFonts w:ascii="Quattrocento Sans" w:hAnsi="Quattrocento Sans"/>
+          <w:sz w:val="24"/>
+          <w:szCs w:val="24"/>
+          <w:color w:val="000000"/>
+          <w:b/>
+        </w:rPr>
+        <w:t xml:space="preserve">Importante: </w:t>
+      </w:r>
+      <w:r>
+        <w:rPr>
+          <w:rFonts w:ascii="Quattrocento Sans" w:hAnsi="Quattrocento Sans"/>
+          <w:sz w:val="24"/>
+          <w:szCs w:val="24"/>
+          <w:color w:val="000000"/>
+        </w:rPr>
+        <w:t>Mesmo sem a autorização de urgência, a ação principal segue firme. Temos bons argumentos e documentação médica robusta. O processo ainda pode ser ganho ao final.</w:t>
+      </w:r>
+    </w:p>
+    <w:p>
+      <w:pPr>
+        <w:jc w:val="both"/>
+        <w:spacing w:before="0" w:after="80"/>
+      </w:pPr>
+      <w:r>
+        <w:rPr>
+          <w:rFonts w:ascii="Quattrocento Sans" w:hAnsi="Quattrocento Sans"/>
+          <w:sz w:val="24"/>
+          <w:szCs w:val="24"/>
+          <w:color w:val="000000"/>
+        </w:rPr>
+        <w:t/>
+      </w:r>
+    </w:p>
+    <w:p>
+      <w:pPr>
+        <w:jc w:val="both"/>
+        <w:spacing w:before="240" w:after="80"/>
+      </w:pPr>
+      <w:r>
+        <w:rPr>
+          <w:rFonts w:ascii="Quattrocento Sans" w:hAnsi="Quattrocento Sans"/>
+          <w:sz w:val="24"/>
+          <w:szCs w:val="24"/>
+          <w:color w:val="000000"/>
+          <w:b/>
+        </w:rPr>
+        <w:t>5. O QUE PRECISAMOS DE VOCÊ AGORA</w:t>
+      </w:r>
+    </w:p>
+    <w:p>
+      <w:pPr>
+        <w:jc w:val="both"/>
+        <w:spacing w:before="0" w:after="100"/>
+      </w:pPr>
+      <w:r>
+        <w:rPr>
+          <w:rFonts w:ascii="Quattrocento Sans" w:hAnsi="Quattrocento Sans"/>
+          <w:sz w:val="24"/>
+          <w:szCs w:val="24"/>
+          <w:color w:val="000000"/>
+        </w:rPr>
+        <w:t>Por enquanto, não precisamos de nada de você. Fique tranquila e aguarde nosso contato.</w:t>
+      </w:r>
+    </w:p>
+    <w:p>
+      <w:pPr>
+        <w:jc w:val="both"/>
         <w:spacing w:before="0" w:after="200"/>
+      </w:pPr>
+      <w:r>
+        <w:rPr>
+          <w:rFonts w:ascii="Quattrocento Sans" w:hAnsi="Quattrocento Sans"/>
+          <w:sz w:val="24"/>
+          <w:szCs w:val="24"/>
+          <w:color w:val="000000"/>
+        </w:rPr>
+        <w:t>Porém, caso receba qualquer correspondência, e-mail ou ligação da Unimed ou do tribunal sobre esse processo, nos avise imediatamente antes de responder ou assinar qualquer coisa.</w:t>
+      </w:r>
+    </w:p>
+    <w:p>
+      <w:pPr>
         <w:jc w:val="both"/>
-      </w:pPr>
-      <w:r>
-        <w:rPr>
-          <w:rFonts w:ascii="Quattrocento Sans" w:hAnsi="Quattrocento Sans"/>
-          <w:b w:val="0"/>
-          <w:i w:val="0"/>
-          <w:color w:val="000000"/>
-          <w:sz w:val="24"/>
-        </w:rPr>
-        <w:t>Recorremos da decisão do juiz junto ao Tribunal de Justiça de Santa Catarina (TJSC). Esse recurso tem o número 5043252-17.2026.8.24.0000 e está sendo analisado por desembargadores (juízes do tribunal). Com esse recurso, pedimos que o Tribunal autorize o tratamento de forma urgente, enquanto o processo principal ainda tramita.</w:t>
-      </w:r>
-    </w:p>
-    <w:p>
-      <w:pPr>
-        <w:spacing w:before="280" w:after="80"/>
+        <w:spacing w:before="240" w:after="80"/>
+      </w:pPr>
+      <w:r>
+        <w:rPr>
+          <w:rFonts w:ascii="Quattrocento Sans" w:hAnsi="Quattrocento Sans"/>
+          <w:sz w:val="24"/>
+          <w:szCs w:val="24"/>
+          <w:color w:val="000000"/>
+          <w:b/>
+        </w:rPr>
+        <w:t>6. FICOU COM DÚVIDAS?</w:t>
+      </w:r>
+    </w:p>
+    <w:p>
+      <w:pPr>
         <w:jc w:val="both"/>
-      </w:pPr>
-      <w:r>
-        <w:rPr>
-          <w:rFonts w:ascii="Quattrocento Sans" w:hAnsi="Quattrocento Sans"/>
-          <w:b/>
-          <w:i w:val="0"/>
-          <w:color w:val="000000"/>
-          <w:sz w:val="24"/>
-        </w:rPr>
-        <w:t>3. ONDE ESTAMOS AGORA</w:t>
-      </w:r>
-    </w:p>
-    <w:p>
-      <w:pPr>
-        <w:spacing w:before="0" w:after="80"/>
+        <w:spacing w:before="0" w:after="100"/>
+      </w:pPr>
+      <w:r>
+        <w:rPr>
+          <w:rFonts w:ascii="Quattrocento Sans" w:hAnsi="Quattrocento Sans"/>
+          <w:sz w:val="24"/>
+          <w:szCs w:val="24"/>
+          <w:color w:val="000000"/>
+        </w:rPr>
+        <w:t>Estamos à disposição para conversar sempre que precisar:</w:t>
+      </w:r>
+    </w:p>
+    <w:p>
+      <w:pPr>
         <w:jc w:val="both"/>
-      </w:pPr>
-      <w:r>
-        <w:rPr>
-          <w:rFonts w:ascii="Quattrocento Sans" w:hAnsi="Quattrocento Sans"/>
-          <w:b w:val="0"/>
-          <w:i w:val="0"/>
-          <w:color w:val="000000"/>
-          <w:sz w:val="24"/>
-        </w:rPr>
-        <w:t>Seu caso está em dois lugares ao mesmo tempo:</w:t>
-      </w:r>
-    </w:p>
-    <w:p>
-      <w:pPr>
-        <w:spacing w:after="100"/>
-        <w:ind w:left="567"/>
+        <w:spacing w:before="0" w:after="60"/>
+        <w:ind w:left="720"/>
+      </w:pPr>
+      <w:r>
+        <w:rPr>
+          <w:rFonts w:ascii="Quattrocento Sans" w:hAnsi="Quattrocento Sans"/>
+          <w:sz w:val="24"/>
+          <w:szCs w:val="24"/>
+          <w:color w:val="000000"/>
+        </w:rPr>
+        <w:t>WhatsApp: (49) 98806-1881</w:t>
+      </w:r>
+    </w:p>
+    <w:p>
+      <w:pPr>
         <w:jc w:val="both"/>
-      </w:pPr>
-      <w:r>
-        <w:rPr>
-          <w:rFonts w:ascii="Quattrocento Sans" w:hAnsi="Quattrocento Sans"/>
-          <w:b/>
-          <w:i w:val="0"/>
-          <w:color w:val="000000"/>
-          <w:sz w:val="24"/>
-        </w:rPr>
-        <w:t xml:space="preserve">Na 2ª Vara Cível de Chapecó: </w:t>
-      </w:r>
-      <w:r>
-        <w:rPr>
-          <w:rFonts w:ascii="Quattrocento Sans" w:hAnsi="Quattrocento Sans"/>
-          <w:b w:val="0"/>
-          <w:i w:val="0"/>
-          <w:color w:val="000000"/>
-          <w:sz w:val="24"/>
-        </w:rPr>
-        <w:t>o processo principal segue em andamento. A Unimed será chamada a se defender.</w:t>
-      </w:r>
-    </w:p>
-    <w:p>
-      <w:pPr>
-        <w:spacing w:after="100"/>
-        <w:ind w:left="567"/>
+        <w:spacing w:before="0" w:after="60"/>
+        <w:ind w:left="720"/>
+      </w:pPr>
+      <w:r>
+        <w:rPr>
+          <w:rFonts w:ascii="Quattrocento Sans" w:hAnsi="Quattrocento Sans"/>
+          <w:sz w:val="24"/>
+          <w:szCs w:val="24"/>
+          <w:color w:val="000000"/>
+        </w:rPr>
+        <w:t>E-mail: admflavianecaler@gmail.com</w:t>
+      </w:r>
+    </w:p>
+    <w:p>
+      <w:pPr>
         <w:jc w:val="both"/>
-      </w:pPr>
-      <w:r>
-        <w:rPr>
-          <w:rFonts w:ascii="Quattrocento Sans" w:hAnsi="Quattrocento Sans"/>
-          <w:b/>
-          <w:i w:val="0"/>
-          <w:color w:val="000000"/>
-          <w:sz w:val="24"/>
-        </w:rPr>
-        <w:t xml:space="preserve">No Tribunal de Justiça (TJSC): </w:t>
-      </w:r>
-      <w:r>
-        <w:rPr>
-          <w:rFonts w:ascii="Quattrocento Sans" w:hAnsi="Quattrocento Sans"/>
-          <w:b w:val="0"/>
-          <w:i w:val="0"/>
-          <w:color w:val="000000"/>
-          <w:sz w:val="24"/>
-        </w:rPr>
-        <w:t>o recurso que interpusemos está aguardando análise. Estamos acompanhando de perto.</w:t>
-      </w:r>
-    </w:p>
-    <w:p>
-      <w:pPr>
-        <w:spacing w:before="80" w:after="200"/>
-        <w:jc w:val="both"/>
-      </w:pPr>
-      <w:r>
-        <w:rPr>
-          <w:rFonts w:ascii="Quattrocento Sans" w:hAnsi="Quattrocento Sans"/>
-          <w:b w:val="0"/>
-          <w:i w:val="0"/>
-          <w:color w:val="000000"/>
-          <w:sz w:val="24"/>
-        </w:rPr>
-        <w:t>Estamos acompanhando os dois ao mesmo tempo e você será avisada assim que houver qualquer novidade.</w:t>
-      </w:r>
-    </w:p>
-    <w:p>
-      <w:pPr>
-        <w:spacing w:before="280" w:after="80"/>
-        <w:jc w:val="both"/>
-      </w:pPr>
-      <w:r>
-        <w:rPr>
-          <w:rFonts w:ascii="Quattrocento Sans" w:hAnsi="Quattrocento Sans"/>
-          <w:b/>
-          <w:i w:val="0"/>
-          <w:color w:val="000000"/>
-          <w:sz w:val="24"/>
-        </w:rPr>
-        <w:t>4. O QUE PODE ACONTECER A SEGUIR</w:t>
-      </w:r>
-    </w:p>
-    <w:p>
-      <w:pPr>
-        <w:spacing w:after="100"/>
-        <w:ind w:left="567"/>
-        <w:jc w:val="both"/>
-      </w:pPr>
-      <w:r>
-        <w:rPr>
-          <w:rFonts w:ascii="Quattrocento Sans" w:hAnsi="Quattrocento Sans"/>
-          <w:b/>
-          <w:i w:val="0"/>
-          <w:color w:val="000000"/>
-          <w:sz w:val="24"/>
-        </w:rPr>
-        <w:t xml:space="preserve">Melhor cenário: </w:t>
-      </w:r>
-      <w:r>
-        <w:rPr>
-          <w:rFonts w:ascii="Quattrocento Sans" w:hAnsi="Quattrocento Sans"/>
-          <w:b w:val="0"/>
-          <w:i w:val="0"/>
-          <w:color w:val="000000"/>
-          <w:sz w:val="24"/>
-        </w:rPr>
-        <w:t>O Tribunal aceita o recurso e autoriza o tratamento ainda durante o processo. Isso forçaria a Unimed a custear o implante imediatamente.</w:t>
-      </w:r>
-    </w:p>
-    <w:p>
-      <w:pPr>
-        <w:spacing w:after="100"/>
-        <w:ind w:left="567"/>
-        <w:jc w:val="both"/>
-      </w:pPr>
-      <w:r>
-        <w:rPr>
-          <w:rFonts w:ascii="Quattrocento Sans" w:hAnsi="Quattrocento Sans"/>
-          <w:b/>
-          <w:i w:val="0"/>
-          <w:color w:val="000000"/>
-          <w:sz w:val="24"/>
-        </w:rPr>
-        <w:t xml:space="preserve">Cenário intermediário: </w:t>
-      </w:r>
-      <w:r>
-        <w:rPr>
-          <w:rFonts w:ascii="Quattrocento Sans" w:hAnsi="Quattrocento Sans"/>
-          <w:b w:val="0"/>
-          <w:i w:val="0"/>
-          <w:color w:val="000000"/>
-          <w:sz w:val="24"/>
-        </w:rPr>
-        <w:t>O Tribunal não autoriza agora, mas o processo principal continua. Nesse caso, vamos reunir mais provas e seguir apresentando argumentos ao juiz.</w:t>
-      </w:r>
-    </w:p>
-    <w:p>
-      <w:pPr>
-        <w:spacing w:after="100"/>
-        <w:ind w:left="567"/>
-        <w:jc w:val="both"/>
-      </w:pPr>
-      <w:r>
-        <w:rPr>
-          <w:rFonts w:ascii="Quattrocento Sans" w:hAnsi="Quattrocento Sans"/>
-          <w:b/>
-          <w:i w:val="0"/>
-          <w:color w:val="000000"/>
-          <w:sz w:val="24"/>
-        </w:rPr>
-        <w:t xml:space="preserve">Importante: </w:t>
-      </w:r>
-      <w:r>
-        <w:rPr>
-          <w:rFonts w:ascii="Quattrocento Sans" w:hAnsi="Quattrocento Sans"/>
-          <w:b w:val="0"/>
-          <w:i w:val="0"/>
-          <w:color w:val="000000"/>
-          <w:sz w:val="24"/>
-        </w:rPr>
-        <w:t>Mesmo sem a autorização de urgência, a ação principal segue firme. Temos bons argumentos e documentação médica robusta. O processo ainda pode ser ganho ao final.</w:t>
-      </w:r>
-    </w:p>
-    <w:p>
-      <w:pPr>
-        <w:spacing w:before="0" w:after="80"/>
-        <w:jc w:val="both"/>
-      </w:pPr>
-    </w:p>
-    <w:p>
-      <w:pPr>
-        <w:spacing w:before="280" w:after="80"/>
-        <w:jc w:val="both"/>
-      </w:pPr>
-      <w:r>
-        <w:rPr>
-          <w:rFonts w:ascii="Quattrocento Sans" w:hAnsi="Quattrocento Sans"/>
-          <w:b/>
-          <w:i w:val="0"/>
-          <w:color w:val="000000"/>
-          <w:sz w:val="24"/>
-        </w:rPr>
-        <w:t>5. O QUE PRECISAMOS DE VOCÊ AGORA</w:t>
-      </w:r>
-    </w:p>
-    <w:p>
-      <w:pPr>
-        <w:spacing w:before="0" w:after="100"/>
-        <w:jc w:val="both"/>
-      </w:pPr>
-      <w:r>
-        <w:rPr>
-          <w:rFonts w:ascii="Quattrocento Sans" w:hAnsi="Quattrocento Sans"/>
-          <w:b w:val="0"/>
-          <w:i w:val="0"/>
-          <w:color w:val="000000"/>
-          <w:sz w:val="24"/>
-        </w:rPr>
-        <w:t>Por enquanto, não precisamos de nada de você. Fique tranquila e aguarde nosso contato.</w:t>
-      </w:r>
-    </w:p>
-    <w:p>
-      <w:pPr>
-        <w:spacing w:before="0" w:after="200"/>
-        <w:jc w:val="both"/>
-      </w:pPr>
-      <w:r>
-        <w:rPr>
-          <w:rFonts w:ascii="Quattrocento Sans" w:hAnsi="Quattrocento Sans"/>
-          <w:b w:val="0"/>
-          <w:i w:val="0"/>
-          <w:color w:val="000000"/>
-          <w:sz w:val="24"/>
-        </w:rPr>
-        <w:t>Porém, caso receba qualquer correspondência, e-mail ou ligação da Unimed ou do tribunal sobre esse processo, nos avise imediatamente antes de responder ou assinar qualquer coisa.</w:t>
-      </w:r>
-    </w:p>
-    <w:p>
-      <w:pPr>
-        <w:spacing w:before="280" w:after="80"/>
-        <w:jc w:val="both"/>
-      </w:pPr>
-      <w:r>
-        <w:rPr>
-          <w:rFonts w:ascii="Quattrocento Sans" w:hAnsi="Quattrocento Sans"/>
-          <w:b/>
-          <w:i w:val="0"/>
-          <w:color w:val="000000"/>
-          <w:sz w:val="24"/>
-        </w:rPr>
-        <w:t>6. FICOU COM DÚVIDAS?</w:t>
-      </w:r>
-    </w:p>
-    <w:p>
-      <w:pPr>
-        <w:spacing w:before="0" w:after="100"/>
-        <w:jc w:val="both"/>
-      </w:pPr>
-      <w:r>
-        <w:rPr>
-          <w:rFonts w:ascii="Quattrocento Sans" w:hAnsi="Quattrocento Sans"/>
-          <w:b w:val="0"/>
-          <w:i w:val="0"/>
-          <w:color w:val="000000"/>
-          <w:sz w:val="24"/>
-        </w:rPr>
-        <w:t>Estamos à disposição para conversar sempre que precisar:</w:t>
-      </w:r>
-    </w:p>
-    <w:p>
-      <w:pPr>
-        <w:spacing w:after="60"/>
-        <w:ind w:left="567"/>
-        <w:jc w:val="both"/>
-      </w:pPr>
-      <w:r>
-        <w:rPr>
-          <w:rFonts w:ascii="Quattrocento Sans" w:hAnsi="Quattrocento Sans"/>
-          <w:b w:val="0"/>
-          <w:i w:val="0"/>
-          <w:color w:val="000000"/>
-          <w:sz w:val="24"/>
-        </w:rPr>
-        <w:t>WhatsApp: (49) 98806-1881</w:t>
-      </w:r>
-    </w:p>
-    <w:p>
-      <w:pPr>
-        <w:spacing w:after="60"/>
-        <w:ind w:left="567"/>
-        <w:jc w:val="both"/>
-      </w:pPr>
-      <w:r>
-        <w:rPr>
-          <w:rFonts w:ascii="Quattrocento Sans" w:hAnsi="Quattrocento Sans"/>
-          <w:b w:val="0"/>
-          <w:i w:val="0"/>
-          <w:color w:val="000000"/>
-          <w:sz w:val="24"/>
-        </w:rPr>
-        <w:t>E-mail: admflavianecaler@gmail.com</w:t>
-      </w:r>
-    </w:p>
-    <w:p>
-      <w:pPr>
-        <w:spacing w:after="60"/>
-        <w:ind w:left="567"/>
-        <w:jc w:val="both"/>
-      </w:pPr>
-      <w:r>
-        <w:rPr>
-          <w:rFonts w:ascii="Quattrocento Sans" w:hAnsi="Quattrocento Sans"/>
-          <w:b w:val="0"/>
-          <w:i w:val="0"/>
-          <w:color w:val="000000"/>
-          <w:sz w:val="24"/>
+        <w:spacing w:before="0" w:after="60"/>
+        <w:ind w:left="720"/>
+      </w:pPr>
+      <w:r>
+        <w:rPr>
+          <w:rFonts w:ascii="Quattrocento Sans" w:hAnsi="Quattrocento Sans"/>
+          <w:sz w:val="24"/>
+          <w:szCs w:val="24"/>
+          <w:color w:val="000000"/>
         </w:rPr>
         <w:t>Endereço: Fernando Machado, 141-E, Sala 1001 — Edifício IL Centenário, Chapecó/SC</w:t>
       </w:r>
@@ -596,64 +583,63 @@
     </w:p>
     <w:p>
       <w:pPr>
-        <w:spacing w:before="120" w:after="100"/>
         <w:jc w:val="center"/>
-      </w:pPr>
-      <w:r>
-        <w:rPr>
-          <w:rFonts w:ascii="Quattrocento Sans" w:hAnsi="Quattrocento Sans"/>
-          <w:b w:val="0"/>
+        <w:spacing w:before="120" w:after="120"/>
+      </w:pPr>
+      <w:r>
+        <w:rPr>
+          <w:rFonts w:ascii="Quattrocento Sans" w:hAnsi="Quattrocento Sans"/>
+          <w:sz w:val="24"/>
+          <w:szCs w:val="24"/>
+          <w:color w:val="000000"/>
           <w:i/>
-          <w:color w:val="000000"/>
-          <w:sz w:val="24"/>
         </w:rPr>
         <w:t>Com respeito e comprometimento,</w:t>
       </w:r>
     </w:p>
     <w:p>
       <w:pPr>
+        <w:jc w:val="center"/>
         <w:spacing w:before="0" w:after="40"/>
+      </w:pPr>
+      <w:r>
+        <w:rPr>
+          <w:rFonts w:ascii="Quattrocento Sans" w:hAnsi="Quattrocento Sans"/>
+          <w:sz w:val="24"/>
+          <w:szCs w:val="24"/>
+          <w:color w:val="000000"/>
+          <w:b/>
+        </w:rPr>
+        <w:t>Flaviane Bilhar Caler</w:t>
+      </w:r>
+    </w:p>
+    <w:p>
+      <w:pPr>
         <w:jc w:val="center"/>
-      </w:pPr>
-      <w:r>
-        <w:rPr>
-          <w:rFonts w:ascii="Quattrocento Sans" w:hAnsi="Quattrocento Sans"/>
-          <w:b/>
-          <w:i w:val="0"/>
-          <w:color w:val="000000"/>
-          <w:sz w:val="24"/>
-        </w:rPr>
-        <w:t>Flaviane Bilhar Caler</w:t>
-      </w:r>
-    </w:p>
-    <w:p>
-      <w:pPr>
         <w:spacing w:before="0" w:after="40"/>
+      </w:pPr>
+      <w:r>
+        <w:rPr>
+          <w:rFonts w:ascii="Quattrocento Sans" w:hAnsi="Quattrocento Sans"/>
+          <w:sz w:val="20"/>
+          <w:szCs w:val="20"/>
+          <w:color w:val="000000"/>
+          <w:i/>
+        </w:rPr>
+        <w:t>Advogada — OAB/SC 54.395</w:t>
+      </w:r>
+    </w:p>
+    <w:p>
+      <w:pPr>
         <w:jc w:val="center"/>
-      </w:pPr>
-      <w:r>
-        <w:rPr>
-          <w:rFonts w:ascii="Quattrocento Sans" w:hAnsi="Quattrocento Sans"/>
-          <w:b w:val="0"/>
-          <w:i/>
-          <w:color w:val="000000"/>
+        <w:spacing w:before="0" w:after="0"/>
+      </w:pPr>
+      <w:r>
+        <w:rPr>
+          <w:rFonts w:ascii="Quattrocento Sans" w:hAnsi="Quattrocento Sans"/>
           <w:sz w:val="20"/>
-        </w:rPr>
-        <w:t>Advogada — OAB/SC 54.395</w:t>
-      </w:r>
-    </w:p>
-    <w:p>
-      <w:pPr>
-        <w:spacing w:before="0" w:after="0"/>
-        <w:jc w:val="center"/>
-      </w:pPr>
-      <w:r>
-        <w:rPr>
-          <w:rFonts w:ascii="Quattrocento Sans" w:hAnsi="Quattrocento Sans"/>
-          <w:b w:val="0"/>
-          <w:i w:val="0"/>
-          <w:color w:val="000000"/>
-          <w:sz w:val="20"/>
+          <w:szCs w:val="20"/>
+          <w:color w:val="000000"/>
         </w:rPr>
         <w:t>Direito da Saúde e Direito Previdenciário</w:t>
       </w:r>

</xml_diff>